<commit_message>
Complete volatility forecasting project with GARCH, Random Forest and XGBoost
</commit_message>
<xml_diff>
--- a/Research Project.docx
+++ b/Research Project.docx
@@ -72,28 +72,12 @@
         </w:numPr>
       </w:pPr>
       <w:r>
-        <w:t xml:space="preserve">Financial </w:t>
-      </w:r>
-      <w:proofErr w:type="spellStart"/>
-      <w:r>
-        <w:t>Modeling</w:t>
-      </w:r>
-      <w:proofErr w:type="spellEnd"/>
-      <w:r>
-        <w:t xml:space="preserve"> </w:t>
-      </w:r>
-    </w:p>
-    <w:p>
-      <w:r>
-        <w:t xml:space="preserve">That alone is enough to make you competitive for many </w:t>
-      </w:r>
-      <w:proofErr w:type="gramStart"/>
-      <w:r>
-        <w:t>AI</w:t>
-      </w:r>
-      <w:proofErr w:type="gramEnd"/>
-      <w:r>
-        <w:t>, Data Science, Computational Finance, and Quantitative Finance master's programs.</w:t>
+        <w:t xml:space="preserve">Financial Modeling </w:t>
+      </w:r>
+    </w:p>
+    <w:p>
+      <w:r>
+        <w:t>That alone is enough to make you competitive for many AI, Data Science, Computational Finance, and Quantitative Finance master's programs.</w:t>
       </w:r>
     </w:p>
     <w:p>
@@ -306,23 +290,7 @@
           <w:b/>
           <w:bCs/>
         </w:rPr>
-        <w:t xml:space="preserve">Rule 4: Keep </w:t>
-      </w:r>
-      <w:proofErr w:type="spellStart"/>
-      <w:r>
-        <w:rPr>
-          <w:b/>
-          <w:bCs/>
-        </w:rPr>
-        <w:t>MScFE</w:t>
-      </w:r>
-      <w:proofErr w:type="spellEnd"/>
-      <w:r>
-        <w:rPr>
-          <w:b/>
-          <w:bCs/>
-        </w:rPr>
-        <w:t xml:space="preserve"> Performance High</w:t>
+        <w:t>Rule 4: Keep MScFE Performance High</w:t>
       </w:r>
     </w:p>
     <w:p>
@@ -332,15 +300,7 @@
     </w:p>
     <w:p>
       <w:r>
-        <w:t xml:space="preserve">If coursework gets heavy, prioritize </w:t>
-      </w:r>
-      <w:proofErr w:type="spellStart"/>
-      <w:r>
-        <w:t>MScFE</w:t>
-      </w:r>
-      <w:proofErr w:type="spellEnd"/>
-      <w:r>
-        <w:t xml:space="preserve"> deadlines first.</w:t>
+        <w:t>If coursework gets heavy, prioritize MScFE deadlines first.</w:t>
       </w:r>
     </w:p>
     <w:p>
@@ -510,7 +470,7 @@
     <w:p>
       <w:r>
         <w:pict w14:anchorId="57B03727">
-          <v:rect id="_x0000_i1049" style="width:0;height:1.5pt" o:hralign="center" o:hrstd="t" o:hr="t" fillcolor="#a0a0a0" stroked="f"/>
+          <v:rect id="_x0000_i1025" style="width:0;height:1.5pt" o:hralign="center" o:hrstd="t" o:hr="t" fillcolor="#a0a0a0" stroked="f"/>
         </w:pict>
       </w:r>
     </w:p>
@@ -657,7 +617,7 @@
     <w:p>
       <w:r>
         <w:pict w14:anchorId="1E40C882">
-          <v:rect id="_x0000_i1050" style="width:0;height:1.5pt" o:hralign="center" o:hrstd="t" o:hr="t" fillcolor="#a0a0a0" stroked="f"/>
+          <v:rect id="_x0000_i1026" style="width:0;height:1.5pt" o:hralign="center" o:hrstd="t" o:hr="t" fillcolor="#a0a0a0" stroked="f"/>
         </w:pict>
       </w:r>
     </w:p>
@@ -683,21 +643,12 @@
           <w:bCs/>
         </w:rPr>
       </w:pPr>
-      <w:proofErr w:type="spellStart"/>
-      <w:r>
-        <w:rPr>
-          <w:b/>
-          <w:bCs/>
-        </w:rPr>
-        <w:t>Modeling</w:t>
-      </w:r>
-      <w:proofErr w:type="spellEnd"/>
-      <w:r>
-        <w:rPr>
-          <w:b/>
-          <w:bCs/>
-        </w:rPr>
-        <w:t xml:space="preserve"> Phase</w:t>
+      <w:r>
+        <w:rPr>
+          <w:b/>
+          <w:bCs/>
+        </w:rPr>
+        <w:t>Modeling Phase</w:t>
       </w:r>
     </w:p>
     <w:p>
@@ -734,13 +685,8 @@
           <w:numId w:val="7"/>
         </w:numPr>
       </w:pPr>
-      <w:proofErr w:type="gramStart"/>
-      <w:r>
-        <w:t>GARCH(</w:t>
-      </w:r>
-      <w:proofErr w:type="gramEnd"/>
-      <w:r>
-        <w:t xml:space="preserve">1,1) </w:t>
+      <w:r>
+        <w:t xml:space="preserve">GARCH(1,1) </w:t>
       </w:r>
     </w:p>
     <w:p>
@@ -778,7 +724,7 @@
     <w:p>
       <w:r>
         <w:pict w14:anchorId="3658E7F0">
-          <v:rect id="_x0000_i1051" style="width:0;height:1.5pt" o:hralign="center" o:hrstd="t" o:hr="t" fillcolor="#a0a0a0" stroked="f"/>
+          <v:rect id="_x0000_i1027" style="width:0;height:1.5pt" o:hralign="center" o:hrstd="t" o:hr="t" fillcolor="#a0a0a0" stroked="f"/>
         </w:pict>
       </w:r>
     </w:p>
@@ -930,7 +876,7 @@
     <w:p>
       <w:r>
         <w:pict w14:anchorId="0BC6AB52">
-          <v:rect id="_x0000_i1052" style="width:0;height:1.5pt" o:hralign="center" o:hrstd="t" o:hr="t" fillcolor="#a0a0a0" stroked="f"/>
+          <v:rect id="_x0000_i1028" style="width:0;height:1.5pt" o:hralign="center" o:hrstd="t" o:hr="t" fillcolor="#a0a0a0" stroked="f"/>
         </w:pict>
       </w:r>
     </w:p>
@@ -1021,6 +967,733 @@
     <w:p>
       <w:r>
         <w:t>It becomes evidence.</w:t>
+      </w:r>
+    </w:p>
+    <w:p>
+      <w:pPr>
+        <w:rPr>
+          <w:b/>
+          <w:bCs/>
+        </w:rPr>
+      </w:pPr>
+      <w:r>
+        <w:rPr>
+          <w:b/>
+          <w:bCs/>
+        </w:rPr>
+        <w:t>5.3 GARCH Results</w:t>
+      </w:r>
+    </w:p>
+    <w:p>
+      <w:r>
+        <w:t>The GARCH(1,1) model was evaluated against the baseline forecasting models using identical out-of-sample observations.</w:t>
+      </w:r>
+    </w:p>
+    <w:tbl>
+      <w:tblPr>
+        <w:tblW w:w="0" w:type="auto"/>
+        <w:tblCellSpacing w:w="15" w:type="dxa"/>
+        <w:tblCellMar>
+          <w:top w:w="15" w:type="dxa"/>
+          <w:left w:w="15" w:type="dxa"/>
+          <w:bottom w:w="15" w:type="dxa"/>
+          <w:right w:w="15" w:type="dxa"/>
+        </w:tblCellMar>
+        <w:tblLook w:val="04A0" w:firstRow="1" w:lastRow="0" w:firstColumn="1" w:lastColumn="0" w:noHBand="0" w:noVBand="1"/>
+      </w:tblPr>
+      <w:tblGrid>
+        <w:gridCol w:w="1941"/>
+        <w:gridCol w:w="770"/>
+        <w:gridCol w:w="770"/>
+        <w:gridCol w:w="785"/>
+      </w:tblGrid>
+      <w:tr>
+        <w:trPr>
+          <w:tblHeader/>
+          <w:tblCellSpacing w:w="15" w:type="dxa"/>
+        </w:trPr>
+        <w:tc>
+          <w:tcPr>
+            <w:tcW w:w="0" w:type="auto"/>
+            <w:vAlign w:val="center"/>
+            <w:hideMark/>
+          </w:tcPr>
+          <w:p>
+            <w:pPr>
+              <w:rPr>
+                <w:b/>
+                <w:bCs/>
+              </w:rPr>
+            </w:pPr>
+            <w:r>
+              <w:rPr>
+                <w:b/>
+                <w:bCs/>
+              </w:rPr>
+              <w:t>Model</w:t>
+            </w:r>
+          </w:p>
+        </w:tc>
+        <w:tc>
+          <w:tcPr>
+            <w:tcW w:w="0" w:type="auto"/>
+            <w:vAlign w:val="center"/>
+            <w:hideMark/>
+          </w:tcPr>
+          <w:p>
+            <w:pPr>
+              <w:rPr>
+                <w:b/>
+                <w:bCs/>
+              </w:rPr>
+            </w:pPr>
+            <w:r>
+              <w:rPr>
+                <w:b/>
+                <w:bCs/>
+              </w:rPr>
+              <w:t>QLIKE</w:t>
+            </w:r>
+          </w:p>
+        </w:tc>
+        <w:tc>
+          <w:tcPr>
+            <w:tcW w:w="0" w:type="auto"/>
+            <w:vAlign w:val="center"/>
+            <w:hideMark/>
+          </w:tcPr>
+          <w:p>
+            <w:pPr>
+              <w:rPr>
+                <w:b/>
+                <w:bCs/>
+              </w:rPr>
+            </w:pPr>
+            <w:r>
+              <w:rPr>
+                <w:b/>
+                <w:bCs/>
+              </w:rPr>
+              <w:t>RMSE</w:t>
+            </w:r>
+          </w:p>
+        </w:tc>
+        <w:tc>
+          <w:tcPr>
+            <w:tcW w:w="0" w:type="auto"/>
+            <w:vAlign w:val="center"/>
+            <w:hideMark/>
+          </w:tcPr>
+          <w:p>
+            <w:pPr>
+              <w:rPr>
+                <w:b/>
+                <w:bCs/>
+              </w:rPr>
+            </w:pPr>
+            <w:r>
+              <w:rPr>
+                <w:b/>
+                <w:bCs/>
+              </w:rPr>
+              <w:t>MAE</w:t>
+            </w:r>
+          </w:p>
+        </w:tc>
+      </w:tr>
+      <w:tr>
+        <w:trPr>
+          <w:tblCellSpacing w:w="15" w:type="dxa"/>
+        </w:trPr>
+        <w:tc>
+          <w:tcPr>
+            <w:tcW w:w="0" w:type="auto"/>
+            <w:vAlign w:val="center"/>
+            <w:hideMark/>
+          </w:tcPr>
+          <w:p>
+            <w:r>
+              <w:t>Historical Average</w:t>
+            </w:r>
+          </w:p>
+        </w:tc>
+        <w:tc>
+          <w:tcPr>
+            <w:tcW w:w="0" w:type="auto"/>
+            <w:vAlign w:val="center"/>
+            <w:hideMark/>
+          </w:tcPr>
+          <w:p>
+            <w:r>
+              <w:t>0.3385</w:t>
+            </w:r>
+          </w:p>
+        </w:tc>
+        <w:tc>
+          <w:tcPr>
+            <w:tcW w:w="0" w:type="auto"/>
+            <w:vAlign w:val="center"/>
+            <w:hideMark/>
+          </w:tcPr>
+          <w:p>
+            <w:r>
+              <w:t>0.5819</w:t>
+            </w:r>
+          </w:p>
+        </w:tc>
+        <w:tc>
+          <w:tcPr>
+            <w:tcW w:w="0" w:type="auto"/>
+            <w:vAlign w:val="center"/>
+            <w:hideMark/>
+          </w:tcPr>
+          <w:p>
+            <w:r>
+              <w:t>0.3927</w:t>
+            </w:r>
+          </w:p>
+        </w:tc>
+      </w:tr>
+      <w:tr>
+        <w:trPr>
+          <w:tblCellSpacing w:w="15" w:type="dxa"/>
+        </w:trPr>
+        <w:tc>
+          <w:tcPr>
+            <w:tcW w:w="0" w:type="auto"/>
+            <w:vAlign w:val="center"/>
+            <w:hideMark/>
+          </w:tcPr>
+          <w:p>
+            <w:r>
+              <w:t>GARCH(1,1)</w:t>
+            </w:r>
+          </w:p>
+        </w:tc>
+        <w:tc>
+          <w:tcPr>
+            <w:tcW w:w="0" w:type="auto"/>
+            <w:vAlign w:val="center"/>
+            <w:hideMark/>
+          </w:tcPr>
+          <w:p>
+            <w:r>
+              <w:t>0.3987</w:t>
+            </w:r>
+          </w:p>
+        </w:tc>
+        <w:tc>
+          <w:tcPr>
+            <w:tcW w:w="0" w:type="auto"/>
+            <w:vAlign w:val="center"/>
+            <w:hideMark/>
+          </w:tcPr>
+          <w:p>
+            <w:r>
+              <w:t>0.7552</w:t>
+            </w:r>
+          </w:p>
+        </w:tc>
+        <w:tc>
+          <w:tcPr>
+            <w:tcW w:w="0" w:type="auto"/>
+            <w:vAlign w:val="center"/>
+            <w:hideMark/>
+          </w:tcPr>
+          <w:p>
+            <w:r>
+              <w:t>0.6036</w:t>
+            </w:r>
+          </w:p>
+        </w:tc>
+      </w:tr>
+    </w:tbl>
+    <w:p>
+      <w:r>
+        <w:t>Contrary to expectations, the GARCH(1,1) model did not outperform the historical average benchmark. Across all evaluation metrics, the historical average forecast achieved superior predictive performance.</w:t>
+      </w:r>
+    </w:p>
+    <w:p>
+      <w:r>
+        <w:lastRenderedPageBreak/>
+        <w:t>One possible explanation is that the historical average model directly captures recent realized volatility dynamics, whereas the GARCH model relies solely on return series information. Additionally, the forecasting target in this study is based on the Garman-Klass volatility estimator, which incorporates intraday price information not explicitly modeled within the standard GARCH framework.</w:t>
+      </w:r>
+    </w:p>
+    <w:p>
+      <w:r>
+        <w:t>These findings suggest that simple volatility persistence measures remain highly competitive benchmarks and highlight the importance of evaluating advanced models against strong baseline forecasts.</w:t>
+      </w:r>
+    </w:p>
+    <w:p>
+      <w:pPr>
+        <w:rPr>
+          <w:b/>
+          <w:bCs/>
+        </w:rPr>
+      </w:pPr>
+      <w:r>
+        <w:rPr>
+          <w:b/>
+          <w:bCs/>
+        </w:rPr>
+        <w:t>The Main Research Finding</w:t>
+      </w:r>
+    </w:p>
+    <w:p>
+      <w:r>
+        <w:t>Your evidence supports the conclusion that:</w:t>
+      </w:r>
+    </w:p>
+    <w:p>
+      <w:r>
+        <w:t>Machine learning models outperformed traditional econometric and benchmark approaches in forecasting next-day equity volatility.</w:t>
+      </w:r>
+    </w:p>
+    <w:p>
+      <w:r>
+        <w:t>More specifically:</w:t>
+      </w:r>
+    </w:p>
+    <w:p>
+      <w:pPr>
+        <w:numPr>
+          <w:ilvl w:val="0"/>
+          <w:numId w:val="11"/>
+        </w:numPr>
+      </w:pPr>
+      <w:r>
+        <w:t xml:space="preserve">Random Forest achieved the lowest forecasting loss. </w:t>
+      </w:r>
+    </w:p>
+    <w:p>
+      <w:pPr>
+        <w:numPr>
+          <w:ilvl w:val="0"/>
+          <w:numId w:val="11"/>
+        </w:numPr>
+      </w:pPr>
+      <w:r>
+        <w:t xml:space="preserve">XGBoost also outperformed all traditional benchmarks. </w:t>
+      </w:r>
+    </w:p>
+    <w:p>
+      <w:pPr>
+        <w:numPr>
+          <w:ilvl w:val="0"/>
+          <w:numId w:val="11"/>
+        </w:numPr>
+      </w:pPr>
+      <w:r>
+        <w:t xml:space="preserve">Historical Average beat GARCH(1,1). </w:t>
+      </w:r>
+    </w:p>
+    <w:p>
+      <w:pPr>
+        <w:numPr>
+          <w:ilvl w:val="0"/>
+          <w:numId w:val="11"/>
+        </w:numPr>
+      </w:pPr>
+      <w:r>
+        <w:t xml:space="preserve">GARCH produced the weakest out-of-sample performance. </w:t>
+      </w:r>
+    </w:p>
+    <w:p>
+      <w:r>
+        <w:t>This is a legitimate and interesting result.</w:t>
+      </w:r>
+    </w:p>
+    <w:p>
+      <w:r>
+        <w:pict w14:anchorId="750183D4">
+          <v:rect id="_x0000_i1065" style="width:0;height:1.5pt" o:hralign="center" o:hrstd="t" o:hr="t" fillcolor="#a0a0a0" stroked="f"/>
+        </w:pict>
+      </w:r>
+    </w:p>
+    <w:p>
+      <w:pPr>
+        <w:rPr>
+          <w:b/>
+          <w:bCs/>
+        </w:rPr>
+      </w:pPr>
+      <w:r>
+        <w:rPr>
+          <w:b/>
+          <w:bCs/>
+        </w:rPr>
+        <w:t>Quantifying the Improvement</w:t>
+      </w:r>
+    </w:p>
+    <w:p>
+      <w:pPr>
+        <w:rPr>
+          <w:b/>
+          <w:bCs/>
+        </w:rPr>
+      </w:pPr>
+      <w:r>
+        <w:rPr>
+          <w:b/>
+          <w:bCs/>
+        </w:rPr>
+        <w:t>Random Forest vs Historical Average</w:t>
+      </w:r>
+    </w:p>
+    <w:p>
+      <w:r>
+        <w:t>QLIKE improvement:</w:t>
+      </w:r>
+    </w:p>
+    <w:p>
+      <w:r>
+        <w:t>0.3385−0.27340.3385×100\frac{0.3385 - 0.2734}{0.3385} \times 1000.33850.3385−0.2734</w:t>
+      </w:r>
+      <w:r>
+        <w:rPr>
+          <w:rFonts w:ascii="Arial" w:hAnsi="Arial" w:cs="Arial"/>
+        </w:rPr>
+        <w:t>​</w:t>
+      </w:r>
+      <w:r>
+        <w:t xml:space="preserve">×100 </w:t>
+      </w:r>
+    </w:p>
+    <w:p>
+      <w:r>
+        <w:t xml:space="preserve">≈ </w:t>
+      </w:r>
+      <w:r>
+        <w:rPr>
+          <w:b/>
+          <w:bCs/>
+        </w:rPr>
+        <w:t>19.2% improvement</w:t>
+      </w:r>
+    </w:p>
+    <w:p>
+      <w:r>
+        <w:pict w14:anchorId="562B473D">
+          <v:rect id="_x0000_i1066" style="width:0;height:1.5pt" o:hralign="center" o:hrstd="t" o:hr="t" fillcolor="#a0a0a0" stroked="f"/>
+        </w:pict>
+      </w:r>
+    </w:p>
+    <w:p>
+      <w:pPr>
+        <w:rPr>
+          <w:b/>
+          <w:bCs/>
+        </w:rPr>
+      </w:pPr>
+      <w:r>
+        <w:rPr>
+          <w:b/>
+          <w:bCs/>
+        </w:rPr>
+        <w:t>Random Forest vs GARCH</w:t>
+      </w:r>
+    </w:p>
+    <w:p>
+      <w:r>
+        <w:t>QLIKE improvement:</w:t>
+      </w:r>
+    </w:p>
+    <w:p>
+      <w:r>
+        <w:t>0.3987−0.27340.3987×100\frac{0.3987 - 0.2734}{0.3987} \times 1000.39870.3987−0.2734</w:t>
+      </w:r>
+      <w:r>
+        <w:rPr>
+          <w:rFonts w:ascii="Arial" w:hAnsi="Arial" w:cs="Arial"/>
+        </w:rPr>
+        <w:t>​</w:t>
+      </w:r>
+      <w:r>
+        <w:t xml:space="preserve">×100 </w:t>
+      </w:r>
+    </w:p>
+    <w:p>
+      <w:r>
+        <w:t xml:space="preserve">≈ </w:t>
+      </w:r>
+      <w:r>
+        <w:rPr>
+          <w:b/>
+          <w:bCs/>
+        </w:rPr>
+        <w:t>31.4% improvement</w:t>
+      </w:r>
+    </w:p>
+    <w:p>
+      <w:r>
+        <w:lastRenderedPageBreak/>
+        <w:pict w14:anchorId="5558C64D">
+          <v:rect id="_x0000_i1067" style="width:0;height:1.5pt" o:hralign="center" o:hrstd="t" o:hr="t" fillcolor="#a0a0a0" stroked="f"/>
+        </w:pict>
+      </w:r>
+    </w:p>
+    <w:p>
+      <w:pPr>
+        <w:rPr>
+          <w:b/>
+          <w:bCs/>
+        </w:rPr>
+      </w:pPr>
+      <w:r>
+        <w:rPr>
+          <w:b/>
+          <w:bCs/>
+        </w:rPr>
+        <w:t>XGBoost vs Historical Average</w:t>
+      </w:r>
+    </w:p>
+    <w:p>
+      <w:r>
+        <w:t>QLIKE improvement:</w:t>
+      </w:r>
+    </w:p>
+    <w:p>
+      <w:r>
+        <w:t>0.3385−0.29490.3385×100\frac{0.3385 - 0.2949}{0.3385} \times 1000.33850.3385−0.2949</w:t>
+      </w:r>
+      <w:r>
+        <w:rPr>
+          <w:rFonts w:ascii="Arial" w:hAnsi="Arial" w:cs="Arial"/>
+        </w:rPr>
+        <w:t>​</w:t>
+      </w:r>
+      <w:r>
+        <w:t xml:space="preserve">×100 </w:t>
+      </w:r>
+    </w:p>
+    <w:p>
+      <w:r>
+        <w:t xml:space="preserve">≈ </w:t>
+      </w:r>
+      <w:r>
+        <w:rPr>
+          <w:b/>
+          <w:bCs/>
+        </w:rPr>
+        <w:t>12.9% improvement</w:t>
+      </w:r>
+    </w:p>
+    <w:p>
+      <w:r>
+        <w:pict w14:anchorId="49BC5B54">
+          <v:rect id="_x0000_i1068" style="width:0;height:1.5pt" o:hralign="center" o:hrstd="t" o:hr="t" fillcolor="#a0a0a0" stroked="f"/>
+        </w:pict>
+      </w:r>
+    </w:p>
+    <w:p>
+      <w:pPr>
+        <w:rPr>
+          <w:b/>
+          <w:bCs/>
+        </w:rPr>
+      </w:pPr>
+      <w:r>
+        <w:rPr>
+          <w:b/>
+          <w:bCs/>
+        </w:rPr>
+        <w:t>What This Means</w:t>
+      </w:r>
+    </w:p>
+    <w:p>
+      <w:r>
+        <w:t>The most important takeaway isn't:</w:t>
+      </w:r>
+    </w:p>
+    <w:p>
+      <w:r>
+        <w:t>"Random Forest won."</w:t>
+      </w:r>
+    </w:p>
+    <w:p>
+      <w:r>
+        <w:t>The important takeaway is:</w:t>
+      </w:r>
+    </w:p>
+    <w:p>
+      <w:r>
+        <w:t>The richer feature set added predictive value.</w:t>
+      </w:r>
+    </w:p>
+    <w:p>
+      <w:r>
+        <w:t>Your machine learning models could use:</w:t>
+      </w:r>
+    </w:p>
+    <w:p>
+      <w:pPr>
+        <w:numPr>
+          <w:ilvl w:val="0"/>
+          <w:numId w:val="12"/>
+        </w:numPr>
+      </w:pPr>
+      <w:r>
+        <w:t xml:space="preserve">Rolling volatility </w:t>
+      </w:r>
+    </w:p>
+    <w:p>
+      <w:pPr>
+        <w:numPr>
+          <w:ilvl w:val="0"/>
+          <w:numId w:val="12"/>
+        </w:numPr>
+      </w:pPr>
+      <w:r>
+        <w:t xml:space="preserve">VIX information </w:t>
+      </w:r>
+    </w:p>
+    <w:p>
+      <w:pPr>
+        <w:numPr>
+          <w:ilvl w:val="0"/>
+          <w:numId w:val="12"/>
+        </w:numPr>
+      </w:pPr>
+      <w:r>
+        <w:t xml:space="preserve">SPY behavior </w:t>
+      </w:r>
+    </w:p>
+    <w:p>
+      <w:pPr>
+        <w:numPr>
+          <w:ilvl w:val="0"/>
+          <w:numId w:val="12"/>
+        </w:numPr>
+      </w:pPr>
+      <w:r>
+        <w:t xml:space="preserve">MSFT behavior </w:t>
+      </w:r>
+    </w:p>
+    <w:p>
+      <w:pPr>
+        <w:numPr>
+          <w:ilvl w:val="0"/>
+          <w:numId w:val="12"/>
+        </w:numPr>
+      </w:pPr>
+      <w:r>
+        <w:t xml:space="preserve">Volume dynamics </w:t>
+      </w:r>
+    </w:p>
+    <w:p>
+      <w:pPr>
+        <w:numPr>
+          <w:ilvl w:val="0"/>
+          <w:numId w:val="12"/>
+        </w:numPr>
+      </w:pPr>
+      <w:r>
+        <w:t xml:space="preserve">Lagged returns </w:t>
+      </w:r>
+    </w:p>
+    <w:p>
+      <w:r>
+        <w:t>GARCH could not.</w:t>
+      </w:r>
+    </w:p>
+    <w:p>
+      <w:r>
+        <w:t>That is likely the core reason for the performance gap.</w:t>
+      </w:r>
+    </w:p>
+    <w:p>
+      <w:r>
+        <w:pict w14:anchorId="5A0879CF">
+          <v:rect id="_x0000_i1069" style="width:0;height:1.5pt" o:hralign="center" o:hrstd="t" o:hr="t" fillcolor="#a0a0a0" stroked="f"/>
+        </w:pict>
+      </w:r>
+    </w:p>
+    <w:p>
+      <w:pPr>
+        <w:rPr>
+          <w:b/>
+          <w:bCs/>
+        </w:rPr>
+      </w:pPr>
+      <w:r>
+        <w:rPr>
+          <w:b/>
+          <w:bCs/>
+        </w:rPr>
+        <w:t>Paper Conclusion Draft</w:t>
+      </w:r>
+    </w:p>
+    <w:p>
+      <w:r>
+        <w:t>You can almost paste this directly.</w:t>
+      </w:r>
+    </w:p>
+    <w:p>
+      <w:pPr>
+        <w:rPr>
+          <w:b/>
+          <w:bCs/>
+        </w:rPr>
+      </w:pPr>
+      <w:r>
+        <w:rPr>
+          <w:b/>
+          <w:bCs/>
+        </w:rPr>
+        <w:t>8. Conclusion</w:t>
+      </w:r>
+    </w:p>
+    <w:p>
+      <w:r>
+        <w:t>This study compared traditional econometric and machine learning approaches for forecasting next-day equity volatility. Using daily market data from Apple Inc. (AAPL) together with market-wide, sentiment, and cross-asset indicators, a comprehensive feature set was constructed and evaluated within a unified forecasting framework.</w:t>
+      </w:r>
+    </w:p>
+    <w:p>
+      <w:r>
+        <w:lastRenderedPageBreak/>
+        <w:t>The empirical results demonstrate that machine learning models substantially outperformed traditional volatility forecasting approaches. Random Forest achieved the strongest performance with a QLIKE loss of 0.2734, followed by XGBoost with a QLIKE loss of 0.2949. Both models exceeded the performance of the historical average benchmark and the GARCH(1,1) model.</w:t>
+      </w:r>
+    </w:p>
+    <w:p>
+      <w:r>
+        <w:t>The findings suggest that future volatility is influenced by complex nonlinear interactions among market variables that are not fully captured by traditional econometric specifications. Incorporating information from volatility persistence, market sentiment, trading activity, and cross-asset relationships appears to improve forecasting accuracy.</w:t>
+      </w:r>
+    </w:p>
+    <w:p>
+      <w:r>
+        <w:t>Overall, the results support the growing body of evidence that machine learning methods can provide meaningful improvements in volatility forecasting when combined with carefully engineered financial features.</w:t>
+      </w:r>
+    </w:p>
+    <w:p>
+      <w:r>
+        <w:pict w14:anchorId="1235E14E">
+          <v:rect id="_x0000_i1070" style="width:0;height:1.5pt" o:hralign="center" o:hrstd="t" o:hr="t" fillcolor="#a0a0a0" stroked="f"/>
+        </w:pict>
+      </w:r>
+    </w:p>
+    <w:p>
+      <w:pPr>
+        <w:rPr>
+          <w:b/>
+          <w:bCs/>
+        </w:rPr>
+      </w:pPr>
+      <w:r>
+        <w:rPr>
+          <w:b/>
+          <w:bCs/>
+        </w:rPr>
+        <w:t>CV Bullet Point</w:t>
+      </w:r>
+    </w:p>
+    <w:p>
+      <w:r>
+        <w:t>You now have something strong enough to put on a graduate-school CV:</w:t>
+      </w:r>
+    </w:p>
+    <w:p>
+      <w:r>
+        <w:t>Conducted an independent quantitative research project comparing GARCH(1,1), Random Forest, and XGBoost models for equity volatility forecasting using 10 years of market data and engineered financial features. Random Forest achieved a 19.2% reduction in QLIKE loss relative to traditional volatility benchmarks.</w:t>
       </w:r>
     </w:p>
     <w:p/>
@@ -1037,6 +1710,155 @@
 <file path=word/numbering.xml><?xml version="1.0" encoding="utf-8"?>
 <w:numbering xmlns:wpc="http://schemas.microsoft.com/office/word/2010/wordprocessingCanvas" xmlns:cx="http://schemas.microsoft.com/office/drawing/2014/chartex" xmlns:cx1="http://schemas.microsoft.com/office/drawing/2015/9/8/chartex" xmlns:cx2="http://schemas.microsoft.com/office/drawing/2015/10/21/chartex" xmlns:cx3="http://schemas.microsoft.com/office/drawing/2016/5/9/chartex" xmlns:cx4="http://schemas.microsoft.com/office/drawing/2016/5/10/chartex" xmlns:cx5="http://schemas.microsoft.com/office/drawing/2016/5/11/chartex" xmlns:cx6="http://schemas.microsoft.com/office/drawing/2016/5/12/chartex" xmlns:cx7="http://schemas.microsoft.com/office/drawing/2016/5/13/chartex" xmlns:cx8="http://schemas.microsoft.com/office/drawing/2016/5/14/chartex" xmlns:mc="http://schemas.openxmlformats.org/markup-compatibility/2006" xmlns:aink="http://schemas.microsoft.com/office/drawing/2016/ink" xmlns:am3d="http://schemas.microsoft.com/office/drawing/2017/model3d" xmlns:o="urn:schemas-microsoft-com:office:office" xmlns:oel="http://schemas.microsoft.com/office/2019/extlst" xmlns:r="http://schemas.openxmlformats.org/officeDocument/2006/relationships" xmlns:m="http://schemas.openxmlformats.org/officeDocument/2006/math" xmlns:v="urn:schemas-microsoft-com:vml" xmlns:wp14="http://schemas.microsoft.com/office/word/2010/wordprocessingDrawing" xmlns:wp="http://schemas.openxmlformats.org/drawingml/2006/wordprocessingDrawing" xmlns:w10="urn:schemas-microsoft-com:office:word" xmlns:w="http://schemas.openxmlformats.org/wordprocessingml/2006/main" xmlns:w14="http://schemas.microsoft.com/office/word/2010/wordml" xmlns:w15="http://schemas.microsoft.com/office/word/2012/wordml" xmlns:w16cex="http://schemas.microsoft.com/office/word/2018/wordml/cex" xmlns:w16cid="http://schemas.microsoft.com/office/word/2016/wordml/cid" xmlns:w16="http://schemas.microsoft.com/office/word/2018/wordml" xmlns:w16sdtdh="http://schemas.microsoft.com/office/word/2020/wordml/sdtdatahash" xmlns:w16se="http://schemas.microsoft.com/office/word/2015/wordml/symex" xmlns:wpg="http://schemas.microsoft.com/office/word/2010/wordprocessingGroup" xmlns:wpi="http://schemas.microsoft.com/office/word/2010/wordprocessingInk" xmlns:wne="http://schemas.microsoft.com/office/word/2006/wordml" xmlns:wps="http://schemas.microsoft.com/office/word/2010/wordprocessingShape" mc:Ignorable="w14 w15 w16se w16cid w16 w16cex w16sdtdh wp14">
   <w:abstractNum w:abstractNumId="0" w15:restartNumberingAfterBreak="0">
+    <w:nsid w:val="03B14BC4"/>
+    <w:multiLevelType w:val="multilevel"/>
+    <w:tmpl w:val="ADF65BFC"/>
+    <w:lvl w:ilvl="0">
+      <w:start w:val="1"/>
+      <w:numFmt w:val="bullet"/>
+      <w:lvlText w:val=""/>
+      <w:lvlJc w:val="left"/>
+      <w:pPr>
+        <w:tabs>
+          <w:tab w:val="num" w:pos="720"/>
+        </w:tabs>
+        <w:ind w:left="720" w:hanging="360"/>
+      </w:pPr>
+      <w:rPr>
+        <w:rFonts w:ascii="Symbol" w:hAnsi="Symbol" w:hint="default"/>
+        <w:sz w:val="20"/>
+      </w:rPr>
+    </w:lvl>
+    <w:lvl w:ilvl="1" w:tentative="1">
+      <w:start w:val="1"/>
+      <w:numFmt w:val="bullet"/>
+      <w:lvlText w:val="o"/>
+      <w:lvlJc w:val="left"/>
+      <w:pPr>
+        <w:tabs>
+          <w:tab w:val="num" w:pos="1440"/>
+        </w:tabs>
+        <w:ind w:left="1440" w:hanging="360"/>
+      </w:pPr>
+      <w:rPr>
+        <w:rFonts w:ascii="Courier New" w:hAnsi="Courier New" w:hint="default"/>
+        <w:sz w:val="20"/>
+      </w:rPr>
+    </w:lvl>
+    <w:lvl w:ilvl="2" w:tentative="1">
+      <w:start w:val="1"/>
+      <w:numFmt w:val="bullet"/>
+      <w:lvlText w:val=""/>
+      <w:lvlJc w:val="left"/>
+      <w:pPr>
+        <w:tabs>
+          <w:tab w:val="num" w:pos="2160"/>
+        </w:tabs>
+        <w:ind w:left="2160" w:hanging="360"/>
+      </w:pPr>
+      <w:rPr>
+        <w:rFonts w:ascii="Wingdings" w:hAnsi="Wingdings" w:hint="default"/>
+        <w:sz w:val="20"/>
+      </w:rPr>
+    </w:lvl>
+    <w:lvl w:ilvl="3" w:tentative="1">
+      <w:start w:val="1"/>
+      <w:numFmt w:val="bullet"/>
+      <w:lvlText w:val=""/>
+      <w:lvlJc w:val="left"/>
+      <w:pPr>
+        <w:tabs>
+          <w:tab w:val="num" w:pos="2880"/>
+        </w:tabs>
+        <w:ind w:left="2880" w:hanging="360"/>
+      </w:pPr>
+      <w:rPr>
+        <w:rFonts w:ascii="Wingdings" w:hAnsi="Wingdings" w:hint="default"/>
+        <w:sz w:val="20"/>
+      </w:rPr>
+    </w:lvl>
+    <w:lvl w:ilvl="4" w:tentative="1">
+      <w:start w:val="1"/>
+      <w:numFmt w:val="bullet"/>
+      <w:lvlText w:val=""/>
+      <w:lvlJc w:val="left"/>
+      <w:pPr>
+        <w:tabs>
+          <w:tab w:val="num" w:pos="3600"/>
+        </w:tabs>
+        <w:ind w:left="3600" w:hanging="360"/>
+      </w:pPr>
+      <w:rPr>
+        <w:rFonts w:ascii="Wingdings" w:hAnsi="Wingdings" w:hint="default"/>
+        <w:sz w:val="20"/>
+      </w:rPr>
+    </w:lvl>
+    <w:lvl w:ilvl="5" w:tentative="1">
+      <w:start w:val="1"/>
+      <w:numFmt w:val="bullet"/>
+      <w:lvlText w:val=""/>
+      <w:lvlJc w:val="left"/>
+      <w:pPr>
+        <w:tabs>
+          <w:tab w:val="num" w:pos="4320"/>
+        </w:tabs>
+        <w:ind w:left="4320" w:hanging="360"/>
+      </w:pPr>
+      <w:rPr>
+        <w:rFonts w:ascii="Wingdings" w:hAnsi="Wingdings" w:hint="default"/>
+        <w:sz w:val="20"/>
+      </w:rPr>
+    </w:lvl>
+    <w:lvl w:ilvl="6" w:tentative="1">
+      <w:start w:val="1"/>
+      <w:numFmt w:val="bullet"/>
+      <w:lvlText w:val=""/>
+      <w:lvlJc w:val="left"/>
+      <w:pPr>
+        <w:tabs>
+          <w:tab w:val="num" w:pos="5040"/>
+        </w:tabs>
+        <w:ind w:left="5040" w:hanging="360"/>
+      </w:pPr>
+      <w:rPr>
+        <w:rFonts w:ascii="Wingdings" w:hAnsi="Wingdings" w:hint="default"/>
+        <w:sz w:val="20"/>
+      </w:rPr>
+    </w:lvl>
+    <w:lvl w:ilvl="7" w:tentative="1">
+      <w:start w:val="1"/>
+      <w:numFmt w:val="bullet"/>
+      <w:lvlText w:val=""/>
+      <w:lvlJc w:val="left"/>
+      <w:pPr>
+        <w:tabs>
+          <w:tab w:val="num" w:pos="5760"/>
+        </w:tabs>
+        <w:ind w:left="5760" w:hanging="360"/>
+      </w:pPr>
+      <w:rPr>
+        <w:rFonts w:ascii="Wingdings" w:hAnsi="Wingdings" w:hint="default"/>
+        <w:sz w:val="20"/>
+      </w:rPr>
+    </w:lvl>
+    <w:lvl w:ilvl="8" w:tentative="1">
+      <w:start w:val="1"/>
+      <w:numFmt w:val="bullet"/>
+      <w:lvlText w:val=""/>
+      <w:lvlJc w:val="left"/>
+      <w:pPr>
+        <w:tabs>
+          <w:tab w:val="num" w:pos="6480"/>
+        </w:tabs>
+        <w:ind w:left="6480" w:hanging="360"/>
+      </w:pPr>
+      <w:rPr>
+        <w:rFonts w:ascii="Wingdings" w:hAnsi="Wingdings" w:hint="default"/>
+        <w:sz w:val="20"/>
+      </w:rPr>
+    </w:lvl>
+  </w:abstractNum>
+  <w:abstractNum w:abstractNumId="1" w15:restartNumberingAfterBreak="0">
     <w:nsid w:val="2FBB51FB"/>
     <w:multiLevelType w:val="multilevel"/>
     <w:tmpl w:val="88467F9A"/>
@@ -1185,7 +2007,7 @@
       </w:rPr>
     </w:lvl>
   </w:abstractNum>
-  <w:abstractNum w:abstractNumId="1" w15:restartNumberingAfterBreak="0">
+  <w:abstractNum w:abstractNumId="2" w15:restartNumberingAfterBreak="0">
     <w:nsid w:val="3C321BDB"/>
     <w:multiLevelType w:val="multilevel"/>
     <w:tmpl w:val="B024CD24"/>
@@ -1334,7 +2156,7 @@
       </w:rPr>
     </w:lvl>
   </w:abstractNum>
-  <w:abstractNum w:abstractNumId="2" w15:restartNumberingAfterBreak="0">
+  <w:abstractNum w:abstractNumId="3" w15:restartNumberingAfterBreak="0">
     <w:nsid w:val="41D12495"/>
     <w:multiLevelType w:val="multilevel"/>
     <w:tmpl w:val="2A485952"/>
@@ -1483,7 +2305,7 @@
       </w:rPr>
     </w:lvl>
   </w:abstractNum>
-  <w:abstractNum w:abstractNumId="3" w15:restartNumberingAfterBreak="0">
+  <w:abstractNum w:abstractNumId="4" w15:restartNumberingAfterBreak="0">
     <w:nsid w:val="474F62B9"/>
     <w:multiLevelType w:val="multilevel"/>
     <w:tmpl w:val="37067186"/>
@@ -1596,7 +2418,7 @@
       </w:pPr>
     </w:lvl>
   </w:abstractNum>
-  <w:abstractNum w:abstractNumId="4" w15:restartNumberingAfterBreak="0">
+  <w:abstractNum w:abstractNumId="5" w15:restartNumberingAfterBreak="0">
     <w:nsid w:val="4C187C21"/>
     <w:multiLevelType w:val="multilevel"/>
     <w:tmpl w:val="A0E617D8"/>
@@ -1745,7 +2567,7 @@
       </w:rPr>
     </w:lvl>
   </w:abstractNum>
-  <w:abstractNum w:abstractNumId="5" w15:restartNumberingAfterBreak="0">
+  <w:abstractNum w:abstractNumId="6" w15:restartNumberingAfterBreak="0">
     <w:nsid w:val="54E7604E"/>
     <w:multiLevelType w:val="multilevel"/>
     <w:tmpl w:val="A574D520"/>
@@ -1858,7 +2680,7 @@
       </w:pPr>
     </w:lvl>
   </w:abstractNum>
-  <w:abstractNum w:abstractNumId="6" w15:restartNumberingAfterBreak="0">
+  <w:abstractNum w:abstractNumId="7" w15:restartNumberingAfterBreak="0">
     <w:nsid w:val="563576FA"/>
     <w:multiLevelType w:val="multilevel"/>
     <w:tmpl w:val="28F8339E"/>
@@ -2007,7 +2829,156 @@
       </w:rPr>
     </w:lvl>
   </w:abstractNum>
-  <w:abstractNum w:abstractNumId="7" w15:restartNumberingAfterBreak="0">
+  <w:abstractNum w:abstractNumId="8" w15:restartNumberingAfterBreak="0">
+    <w:nsid w:val="6BE32896"/>
+    <w:multiLevelType w:val="multilevel"/>
+    <w:tmpl w:val="8D2E9A8C"/>
+    <w:lvl w:ilvl="0">
+      <w:start w:val="1"/>
+      <w:numFmt w:val="bullet"/>
+      <w:lvlText w:val=""/>
+      <w:lvlJc w:val="left"/>
+      <w:pPr>
+        <w:tabs>
+          <w:tab w:val="num" w:pos="720"/>
+        </w:tabs>
+        <w:ind w:left="720" w:hanging="360"/>
+      </w:pPr>
+      <w:rPr>
+        <w:rFonts w:ascii="Symbol" w:hAnsi="Symbol" w:hint="default"/>
+        <w:sz w:val="20"/>
+      </w:rPr>
+    </w:lvl>
+    <w:lvl w:ilvl="1" w:tentative="1">
+      <w:start w:val="1"/>
+      <w:numFmt w:val="bullet"/>
+      <w:lvlText w:val="o"/>
+      <w:lvlJc w:val="left"/>
+      <w:pPr>
+        <w:tabs>
+          <w:tab w:val="num" w:pos="1440"/>
+        </w:tabs>
+        <w:ind w:left="1440" w:hanging="360"/>
+      </w:pPr>
+      <w:rPr>
+        <w:rFonts w:ascii="Courier New" w:hAnsi="Courier New" w:hint="default"/>
+        <w:sz w:val="20"/>
+      </w:rPr>
+    </w:lvl>
+    <w:lvl w:ilvl="2" w:tentative="1">
+      <w:start w:val="1"/>
+      <w:numFmt w:val="bullet"/>
+      <w:lvlText w:val=""/>
+      <w:lvlJc w:val="left"/>
+      <w:pPr>
+        <w:tabs>
+          <w:tab w:val="num" w:pos="2160"/>
+        </w:tabs>
+        <w:ind w:left="2160" w:hanging="360"/>
+      </w:pPr>
+      <w:rPr>
+        <w:rFonts w:ascii="Wingdings" w:hAnsi="Wingdings" w:hint="default"/>
+        <w:sz w:val="20"/>
+      </w:rPr>
+    </w:lvl>
+    <w:lvl w:ilvl="3" w:tentative="1">
+      <w:start w:val="1"/>
+      <w:numFmt w:val="bullet"/>
+      <w:lvlText w:val=""/>
+      <w:lvlJc w:val="left"/>
+      <w:pPr>
+        <w:tabs>
+          <w:tab w:val="num" w:pos="2880"/>
+        </w:tabs>
+        <w:ind w:left="2880" w:hanging="360"/>
+      </w:pPr>
+      <w:rPr>
+        <w:rFonts w:ascii="Wingdings" w:hAnsi="Wingdings" w:hint="default"/>
+        <w:sz w:val="20"/>
+      </w:rPr>
+    </w:lvl>
+    <w:lvl w:ilvl="4" w:tentative="1">
+      <w:start w:val="1"/>
+      <w:numFmt w:val="bullet"/>
+      <w:lvlText w:val=""/>
+      <w:lvlJc w:val="left"/>
+      <w:pPr>
+        <w:tabs>
+          <w:tab w:val="num" w:pos="3600"/>
+        </w:tabs>
+        <w:ind w:left="3600" w:hanging="360"/>
+      </w:pPr>
+      <w:rPr>
+        <w:rFonts w:ascii="Wingdings" w:hAnsi="Wingdings" w:hint="default"/>
+        <w:sz w:val="20"/>
+      </w:rPr>
+    </w:lvl>
+    <w:lvl w:ilvl="5" w:tentative="1">
+      <w:start w:val="1"/>
+      <w:numFmt w:val="bullet"/>
+      <w:lvlText w:val=""/>
+      <w:lvlJc w:val="left"/>
+      <w:pPr>
+        <w:tabs>
+          <w:tab w:val="num" w:pos="4320"/>
+        </w:tabs>
+        <w:ind w:left="4320" w:hanging="360"/>
+      </w:pPr>
+      <w:rPr>
+        <w:rFonts w:ascii="Wingdings" w:hAnsi="Wingdings" w:hint="default"/>
+        <w:sz w:val="20"/>
+      </w:rPr>
+    </w:lvl>
+    <w:lvl w:ilvl="6" w:tentative="1">
+      <w:start w:val="1"/>
+      <w:numFmt w:val="bullet"/>
+      <w:lvlText w:val=""/>
+      <w:lvlJc w:val="left"/>
+      <w:pPr>
+        <w:tabs>
+          <w:tab w:val="num" w:pos="5040"/>
+        </w:tabs>
+        <w:ind w:left="5040" w:hanging="360"/>
+      </w:pPr>
+      <w:rPr>
+        <w:rFonts w:ascii="Wingdings" w:hAnsi="Wingdings" w:hint="default"/>
+        <w:sz w:val="20"/>
+      </w:rPr>
+    </w:lvl>
+    <w:lvl w:ilvl="7" w:tentative="1">
+      <w:start w:val="1"/>
+      <w:numFmt w:val="bullet"/>
+      <w:lvlText w:val=""/>
+      <w:lvlJc w:val="left"/>
+      <w:pPr>
+        <w:tabs>
+          <w:tab w:val="num" w:pos="5760"/>
+        </w:tabs>
+        <w:ind w:left="5760" w:hanging="360"/>
+      </w:pPr>
+      <w:rPr>
+        <w:rFonts w:ascii="Wingdings" w:hAnsi="Wingdings" w:hint="default"/>
+        <w:sz w:val="20"/>
+      </w:rPr>
+    </w:lvl>
+    <w:lvl w:ilvl="8" w:tentative="1">
+      <w:start w:val="1"/>
+      <w:numFmt w:val="bullet"/>
+      <w:lvlText w:val=""/>
+      <w:lvlJc w:val="left"/>
+      <w:pPr>
+        <w:tabs>
+          <w:tab w:val="num" w:pos="6480"/>
+        </w:tabs>
+        <w:ind w:left="6480" w:hanging="360"/>
+      </w:pPr>
+      <w:rPr>
+        <w:rFonts w:ascii="Wingdings" w:hAnsi="Wingdings" w:hint="default"/>
+        <w:sz w:val="20"/>
+      </w:rPr>
+    </w:lvl>
+  </w:abstractNum>
+  <w:abstractNum w:abstractNumId="9" w15:restartNumberingAfterBreak="0">
     <w:nsid w:val="77216E60"/>
     <w:multiLevelType w:val="multilevel"/>
     <w:tmpl w:val="705CDF68"/>
@@ -2156,7 +3127,7 @@
       </w:rPr>
     </w:lvl>
   </w:abstractNum>
-  <w:abstractNum w:abstractNumId="8" w15:restartNumberingAfterBreak="0">
+  <w:abstractNum w:abstractNumId="10" w15:restartNumberingAfterBreak="0">
     <w:nsid w:val="7ACE7A69"/>
     <w:multiLevelType w:val="multilevel"/>
     <w:tmpl w:val="A78C5630"/>
@@ -2305,7 +3276,7 @@
       </w:rPr>
     </w:lvl>
   </w:abstractNum>
-  <w:abstractNum w:abstractNumId="9" w15:restartNumberingAfterBreak="0">
+  <w:abstractNum w:abstractNumId="11" w15:restartNumberingAfterBreak="0">
     <w:nsid w:val="7D196DFB"/>
     <w:multiLevelType w:val="multilevel"/>
     <w:tmpl w:val="2544F2EA"/>
@@ -2455,34 +3426,40 @@
     </w:lvl>
   </w:abstractNum>
   <w:num w:numId="1" w16cid:durableId="694697202">
+    <w:abstractNumId w:val="9"/>
+  </w:num>
+  <w:num w:numId="2" w16cid:durableId="180559115">
+    <w:abstractNumId w:val="3"/>
+  </w:num>
+  <w:num w:numId="3" w16cid:durableId="1078483272">
     <w:abstractNumId w:val="7"/>
   </w:num>
-  <w:num w:numId="2" w16cid:durableId="180559115">
+  <w:num w:numId="4" w16cid:durableId="1719815093">
+    <w:abstractNumId w:val="10"/>
+  </w:num>
+  <w:num w:numId="5" w16cid:durableId="1325161089">
+    <w:abstractNumId w:val="1"/>
+  </w:num>
+  <w:num w:numId="6" w16cid:durableId="232471400">
+    <w:abstractNumId w:val="5"/>
+  </w:num>
+  <w:num w:numId="7" w16cid:durableId="1813985973">
+    <w:abstractNumId w:val="6"/>
+  </w:num>
+  <w:num w:numId="8" w16cid:durableId="1306206097">
+    <w:abstractNumId w:val="11"/>
+  </w:num>
+  <w:num w:numId="9" w16cid:durableId="749814489">
     <w:abstractNumId w:val="2"/>
   </w:num>
-  <w:num w:numId="3" w16cid:durableId="1078483272">
-    <w:abstractNumId w:val="6"/>
+  <w:num w:numId="10" w16cid:durableId="1091589384">
+    <w:abstractNumId w:val="4"/>
   </w:num>
-  <w:num w:numId="4" w16cid:durableId="1719815093">
-    <w:abstractNumId w:val="8"/>
-  </w:num>
-  <w:num w:numId="5" w16cid:durableId="1325161089">
+  <w:num w:numId="11" w16cid:durableId="574434745">
     <w:abstractNumId w:val="0"/>
   </w:num>
-  <w:num w:numId="6" w16cid:durableId="232471400">
-    <w:abstractNumId w:val="4"/>
-  </w:num>
-  <w:num w:numId="7" w16cid:durableId="1813985973">
-    <w:abstractNumId w:val="5"/>
-  </w:num>
-  <w:num w:numId="8" w16cid:durableId="1306206097">
-    <w:abstractNumId w:val="9"/>
-  </w:num>
-  <w:num w:numId="9" w16cid:durableId="749814489">
-    <w:abstractNumId w:val="1"/>
-  </w:num>
-  <w:num w:numId="10" w16cid:durableId="1091589384">
-    <w:abstractNumId w:val="3"/>
+  <w:num w:numId="12" w16cid:durableId="1105924564">
+    <w:abstractNumId w:val="8"/>
   </w:num>
 </w:numbering>
 </file>

</xml_diff>